<commit_message>
Correct research content: current SPS/TBT project, M.S. thesis details, remove em dashes
</commit_message>
<xml_diff>
--- a/assets/files/Manoj_Datta_CV.docx
+++ b/assets/files/Manoj_Datta_CV.docx
@@ -200,7 +200,7 @@
           <w:sz w:val="21"/>
           <w:szCs w:val="21"/>
         </w:rPr>
-        <w:t>International trade policy, agricultural trade, and applied econometrics — including gravity models, panel data methods (TWFE, PPML), and large-scale price-data construction.</w:t>
+        <w:t>International trade policy, agricultural trade, and applied econometrics, including gravity models, panel data methods (TWFE, PPML), non-tariff measures, and spatial and event-study methods.</w:t>
       </w:r>
     </w:p>
     <w:p>
@@ -438,7 +438,7 @@
                 <w:sz w:val="21"/>
                 <w:szCs w:val="21"/>
               </w:rPr>
-              <w:t>U.S. Grain Elevator Spot Price Database: Corn, Soybean &amp; Wheat, 2004–2025</w:t>
+              <w:t>SPS Measures, Technical Barriers to Trade, and U.S. Agricultural Exports</w:t>
             </w:r>
           </w:p>
         </w:tc>
@@ -465,7 +465,7 @@
                 <w:sz w:val="21"/>
                 <w:szCs w:val="21"/>
               </w:rPr>
-              <w:t>Working Paper</w:t>
+              <w:t>In Progress</w:t>
             </w:r>
           </w:p>
         </w:tc>
@@ -500,7 +500,131 @@
                 <w:sz w:val="21"/>
                 <w:szCs w:val="21"/>
               </w:rPr>
-              <w:t>Dissertation research; Advisor: Dr. Jason Grant. Constructing a national panel of daily spot prices from ~3,000 U.S. grain elevators — 20+ million observations (2004–2025) — for commodity market and basis analysis.</w:t>
+              <w:t>With Dr. Jason Grant and Emre Karagulle. Extending USTR's National Trade Estimate barriers database beyond 2021 to study how U.S. agricultural exports adjust following the introduction and removal of SPS/TBT measures, using event-study and staggered difference-in-differences methods.</w:t>
+            </w:r>
+          </w:p>
+        </w:tc>
+      </w:tr>
+    </w:tbl>
+    <w:p>
+      <w:pPr>
+        <w:spacing w:line="240" w:lineRule="auto"/>
+        <w:rPr>
+          <w:rFonts w:ascii="Times New Roman" w:hAnsi="Times New Roman" w:cs="Times New Roman"/>
+          <w:sz w:val="4"/>
+          <w:szCs w:val="4"/>
+        </w:rPr>
+      </w:pPr>
+    </w:p>
+    <w:tbl>
+      <w:tblPr>
+        <w:tblStyle w:val="TableGrid"/>
+        <w:tblW w:w="9774" w:type="dxa"/>
+        <w:tblInd w:w="-113" w:type="dxa"/>
+        <w:tblBorders>
+          <w:top w:val="none" w:sz="0" w:space="0" w:color="auto"/>
+          <w:left w:val="none" w:sz="0" w:space="0" w:color="auto"/>
+          <w:bottom w:val="none" w:sz="0" w:space="0" w:color="auto"/>
+          <w:right w:val="none" w:sz="0" w:space="0" w:color="auto"/>
+          <w:insideH w:val="none" w:sz="0" w:space="0" w:color="auto"/>
+          <w:insideV w:val="none" w:sz="0" w:space="0" w:color="auto"/>
+        </w:tblBorders>
+        <w:tblLook w:val="04A0" w:firstRow="1" w:lastRow="0" w:firstColumn="1" w:lastColumn="0" w:noHBand="0" w:noVBand="1"/>
+      </w:tblPr>
+      <w:tblGrid>
+        <w:gridCol w:w="6943"/>
+        <w:gridCol w:w="2831"/>
+      </w:tblGrid>
+      <w:tr>
+        <w:trPr>
+          <w:trHeight w:val="224"/>
+        </w:trPr>
+        <w:tc>
+          <w:tcPr>
+            <w:tcW w:w="6943" w:type="dxa"/>
+          </w:tcPr>
+          <w:p>
+            <w:pPr>
+              <w:spacing w:line="240" w:lineRule="auto"/>
+              <w:rPr>
+                <w:rFonts w:ascii="Times New Roman" w:hAnsi="Times New Roman" w:cs="Times New Roman"/>
+                <w:b/>
+                <w:bCs/>
+                <w:sz w:val="21"/>
+                <w:szCs w:val="21"/>
+              </w:rPr>
+            </w:pPr>
+            <w:r>
+              <w:rPr>
+                <w:rFonts w:ascii="Times New Roman" w:hAnsi="Times New Roman" w:cs="Times New Roman"/>
+                <w:b/>
+                <w:bCs/>
+                <w:sz w:val="21"/>
+                <w:szCs w:val="21"/>
+              </w:rPr>
+              <w:t>Impact of Processing Plant Entry on U.S. Local Grain Prices: Soybean Crush &amp; Corn Ethanol Plants</w:t>
+            </w:r>
+          </w:p>
+        </w:tc>
+        <w:tc>
+          <w:tcPr>
+            <w:tcW w:w="2831" w:type="dxa"/>
+          </w:tcPr>
+          <w:p>
+            <w:pPr>
+              <w:jc w:val="right"/>
+              <w:rPr>
+                <w:rFonts w:ascii="Times New Roman" w:hAnsi="Times New Roman" w:cs="Times New Roman"/>
+                <w:b/>
+                <w:bCs/>
+                <w:sz w:val="21"/>
+                <w:szCs w:val="21"/>
+              </w:rPr>
+            </w:pPr>
+            <w:r>
+              <w:rPr>
+                <w:rFonts w:ascii="Times New Roman" w:hAnsi="Times New Roman" w:cs="Times New Roman"/>
+                <w:b/>
+                <w:bCs/>
+                <w:sz w:val="21"/>
+                <w:szCs w:val="21"/>
+              </w:rPr>
+              <w:t>M.S. Thesis, 2026</w:t>
+            </w:r>
+          </w:p>
+        </w:tc>
+      </w:tr>
+      <w:tr>
+        <w:trPr>
+          <w:trHeight w:val="192"/>
+        </w:trPr>
+        <w:tc>
+          <w:tcPr>
+            <w:tcW w:w="9774" w:type="dxa"/>
+            <w:gridSpan w:val="2"/>
+          </w:tcPr>
+          <w:p>
+            <w:pPr>
+              <w:pStyle w:val="ListParagraph"/>
+              <w:numPr>
+                <w:ilvl w:val="0"/>
+                <w:numId w:val="2"/>
+              </w:numPr>
+              <w:spacing w:line="240" w:lineRule="auto"/>
+              <w:jc w:val="both"/>
+              <w:rPr>
+                <w:rFonts w:ascii="Times New Roman" w:hAnsi="Times New Roman" w:cs="Times New Roman"/>
+                <w:sz w:val="21"/>
+                <w:szCs w:val="21"/>
+              </w:rPr>
+            </w:pPr>
+            <w:r>
+              <w:rPr>
+                <w:rFonts w:ascii="Times New Roman" w:hAnsi="Times New Roman" w:cs="Times New Roman"/>
+                <w:sz w:val="21"/>
+                <w:szCs w:val="21"/>
+              </w:rPr>
+              <w:t>NDSU; Advisor: Dr. Sandro Steinbach. Difference-in-differences, event-study, and spatial distance-decay models on daily elevator-level prices (2004-2025) show processing-plant entry raises nearby grain prices, e.g. +7.1 cents/bu for soybean and +6.9 cents/bu for corn within 25 miles.</w:t>
             </w:r>
           </w:p>
         </w:tc>
@@ -869,6 +993,7 @@
                 <w:szCs w:val="21"/>
               </w:rPr>
               <w:br/>
+              <w:t>Advisor: Dr. Sandro Steinbach</w:t>
             </w:r>
             <w:r>
               <w:rPr>
@@ -996,6 +1121,14 @@
                 <w:szCs w:val="21"/>
               </w:rPr>
               <w:t xml:space="preserve">GPA- 4.00 </w:t>
+            </w:r>
+            <w:r>
+              <w:rPr>
+                <w:rFonts w:ascii="Times New Roman" w:hAnsi="Times New Roman" w:cs="Times New Roman"/>
+                <w:sz w:val="21"/>
+                <w:szCs w:val="21"/>
+              </w:rPr>
+              <w:br/>
             </w:r>
             <w:r>
               <w:rPr>

</xml_diff>

<commit_message>
Fix Service & Leadership dates: 2025-2026 instead of ongoing
</commit_message>
<xml_diff>
--- a/assets/files/Manoj_Datta_CV.docx
+++ b/assets/files/Manoj_Datta_CV.docx
@@ -1395,7 +1395,7 @@
                 <w:sz w:val="21"/>
                 <w:szCs w:val="21"/>
               </w:rPr>
-              <w:t>2025- ongoing</w:t>
+              <w:t>2025-2026</w:t>
             </w:r>
           </w:p>
         </w:tc>
@@ -1454,7 +1454,7 @@
                 <w:sz w:val="21"/>
                 <w:szCs w:val="21"/>
               </w:rPr>
-              <w:t>2025- ongoing</w:t>
+              <w:t>2025-2026</w:t>
             </w:r>
           </w:p>
         </w:tc>
@@ -1505,7 +1505,7 @@
                 <w:sz w:val="21"/>
                 <w:szCs w:val="21"/>
               </w:rPr>
-              <w:t>2025- ongoing</w:t>
+              <w:t>2025-2026</w:t>
             </w:r>
           </w:p>
         </w:tc>

</xml_diff>